<commit_message>
Docs: Update deployment architecture to Multi-Cloud (Vercel, Render, Aiven)
</commit_message>
<xml_diff>
--- a/docs/BaoCaoChuyenDe1_PhanDinhLuyen.docx
+++ b/docs/BaoCaoChuyenDe1_PhanDinhLuyen.docx
@@ -12051,7 +12051,7 @@
           <w:i w:val="0"/>
           <w:sz w:val="26"/>
         </w:rPr>
-        <w:t>Hệ thống TravelConnect được triển khai thực tế trên hạ tầng điện toán đám mây của Amazon Web Services (AWS) sử dụng dịch vụ máy chủ ảo EC2 (Elastic Compute Cloud). Sơ đồ kiến trúc triển khai được thiết kế như sau:</w:t>
+        <w:t>Hệ thống TravelConnect được triển khai thực tế trên môi trường internet toàn cầu sử dụng mô hình kiến trúc Multi-Cloud tích hợp các dịch vụ đám mây PaaS và SaaS hiện đại. Sơ đồ kiến trúc triển khai thực tế được thiết kế như sau:</w:t>
       </w:r>
     </w:p>
     <w:p>
@@ -12105,7 +12105,7 @@
         <w:rPr>
           <w:rFonts w:ascii="Times New Roman" w:hAnsi="Times New Roman" w:eastAsia="Times New Roman" w:cs="Times New Roman"/>
         </w:rPr>
-        <w:t>Hình 4.1: Sơ đồ kiến trúc triển khai hệ thống trên điện toán đám mây AWS Cloud</w:t>
+        <w:t>Hình 4.1: Sơ đồ kiến trúc triển khai hệ thống trên điện toán đám mây Multi-Cloud</w:t>
       </w:r>
     </w:p>
     <w:p>
@@ -12131,7 +12131,7 @@
           <w:i w:val="0"/>
           <w:sz w:val="26"/>
         </w:rPr>
-        <w:t>1. AWS EC2 Instance: Đóng vai trò là máy chủ vật lý ảo hóa chạy hệ điều hành Ubuntu Server 22.04 LTS. Đây là nơi lưu trữ mã nguồn, chạy Docker Engine và điều phối các Container của ứng dụng.</w:t>
+        <w:t>1. Vercel (Singapore Node): Dịch vụ Cloud PaaS dùng để triển khai Frontend (React + Vite). Tự động tích hợp CI/CD với GitHub, hỗ trợ SSL bảo mật và CDN giúp tải trang tức thì.</w:t>
       </w:r>
     </w:p>
     <w:p>
@@ -12146,7 +12146,7 @@
           <w:i w:val="0"/>
           <w:sz w:val="26"/>
         </w:rPr>
-        <w:t>2. Docker Compose Network: Tạo ra một mạng ảo nội bộ cô lập kết nối giữa các Container:</w:t>
+        <w:t>2. Render (Singapore Node): Dịch vụ Cloud PaaS dùng để chạy Backend (Node.js Express + Socket.IO). Cung cấp môi trường chạy Node.js an toàn, tự động cấu hình cổng (port) động và hỗ trợ WebSockets cho các tính năng tương tác thời gian thực.</w:t>
       </w:r>
     </w:p>
     <w:p>
@@ -12161,7 +12161,7 @@
           <w:i w:val="0"/>
           <w:sz w:val="26"/>
         </w:rPr>
-        <w:t xml:space="preserve">   - Container Frontend (Nginx): Phục vụ các tệp giao diện React đã được biên dịch tĩnh (dist/) hoạt động ở cổng 80.</w:t>
+        <w:t>3. Aiven Cloud MySQL: Dịch vụ Cơ sở dữ liệu đám mây SaaS chạy trên nền tảng AWS/GCP Singapore. Đóng vai trò lưu trữ MySQL 8 an toàn, kết nối bảo mật qua SSL (giao thức bảo mật bắt buộc) ở cổng 24619.</w:t>
       </w:r>
     </w:p>
     <w:p>
@@ -12176,7 +12176,7 @@
           <w:i w:val="0"/>
           <w:sz w:val="26"/>
         </w:rPr>
-        <w:t xml:space="preserve">   - Container Backend (Express/Node.js): Chạy ứng dụng API ở cổng 3000.</w:t>
+        <w:t>4. GitHub Platform: Đóng vai trò là trung tâm quản lý mã nguồn và kích hoạt các đường ống CI/CD tự động. Mỗi khi mã nguồn có cập nhật (git push), Vercel và Render sẽ tự động kéo code mới nhất về và tự động deploy lại.</w:t>
       </w:r>
     </w:p>
     <w:p>
@@ -12191,37 +12191,7 @@
           <w:i w:val="0"/>
           <w:sz w:val="26"/>
         </w:rPr>
-        <w:t xml:space="preserve">   - Container Database (MySQL 8): Chạy hệ quản trị cơ sở dữ liệu ở cổng 3306 nội bộ, ánh xạ ra cổng 3307 của máy chủ để bảo trì.</w:t>
-      </w:r>
-    </w:p>
-    <w:p>
-      <w:pPr>
-        <w:spacing w:line="360" w:lineRule="auto" w:after="120"/>
-        <w:jc w:val="both"/>
-      </w:pPr>
-      <w:r>
-        <w:rPr>
-          <w:rFonts w:ascii="Times New Roman" w:hAnsi="Times New Roman" w:eastAsia="Times New Roman" w:cs="Times New Roman"/>
-          <w:b w:val="0"/>
-          <w:i w:val="0"/>
-          <w:sz w:val="26"/>
-        </w:rPr>
-        <w:t>3. Nginx Reverse Proxy: Đóng vai trò tiếp nhận các yêu cầu truy cập cổng 80 (HTTP) từ Internet, tự động chuyển tiếp (proxy pass) yêu cầu phù hợp: các đường dẫn dạng `/api/*` và socket sẽ được đẩy tới Backend Container, các đường dẫn thông thường được đẩy tới Frontend Container.</w:t>
-      </w:r>
-    </w:p>
-    <w:p>
-      <w:pPr>
-        <w:spacing w:line="360" w:lineRule="auto" w:after="120"/>
-        <w:jc w:val="both"/>
-      </w:pPr>
-      <w:r>
-        <w:rPr>
-          <w:rFonts w:ascii="Times New Roman" w:hAnsi="Times New Roman" w:eastAsia="Times New Roman" w:cs="Times New Roman"/>
-          <w:b w:val="0"/>
-          <w:i w:val="0"/>
-          <w:sz w:val="26"/>
-        </w:rPr>
-        <w:t>4. Gmail SMTP Server: Kết nối an toàn qua giao thức SSL/TLS để gửi mã xác thực OTP tự động cho khách hàng khi đăng ký tài khoản.</w:t>
+        <w:t>5. Mock OTP Logs: Hệ thống ghi nhận mã OTP trực tiếp vào nhật ký (Console Logs) của server Render để vượt qua rào cản chặn cổng SMTP của Render free tier, giúp quá trình đăng ký tài khoản nhanh chóng và bảo mật.</w:t>
       </w:r>
     </w:p>
     <w:p>
@@ -12232,7 +12202,7 @@
         <w:rPr>
           <w:rFonts w:ascii="Times New Roman" w:hAnsi="Times New Roman" w:eastAsia="Times New Roman" w:cs="Times New Roman"/>
         </w:rPr>
-        <w:t>4.2. Quy trình triển khai thực tế trên Cloud AWS</w:t>
+        <w:t>4.2. Quy trình triển khai thực tế trên Cloud</w:t>
       </w:r>
     </w:p>
     <w:p>
@@ -12262,7 +12232,7 @@
           <w:i w:val="0"/>
           <w:sz w:val="26"/>
         </w:rPr>
-        <w:t>Bước 1: Khởi tạo máy chủ ảo AWS EC2</w:t>
+        <w:t>Bước 1: Thiết lập Cơ sở dữ liệu MySQL trên Aiven Cloud</w:t>
       </w:r>
     </w:p>
     <w:p>
@@ -12277,7 +12247,7 @@
           <w:i w:val="0"/>
           <w:sz w:val="26"/>
         </w:rPr>
-        <w:t>- Truy cập AWS Console, tạo mới một EC2 Instance sử dụng AMI Ubuntu Server 22.04 LTS, cấu hình phần cứng t2.micro (1 vCPU, 1 GB RAM - thuộc gói free tier của AWS).</w:t>
+        <w:t>- Truy cập Aiven.io, tạo mới dịch vụ MySQL bản miễn phí đặt tại Singapore.</w:t>
       </w:r>
     </w:p>
     <w:p>
@@ -12292,7 +12262,7 @@
           <w:i w:val="0"/>
           <w:sz w:val="26"/>
         </w:rPr>
-        <w:t>- Khởi tạo và tải xuống cặp khóa bảo mật SSH `.pem` để kết nối vào máy chủ ảo từ xa.</w:t>
+        <w:t>- Lấy thông tin kết nối an toàn bao gồm Host name, Port (24619), User (avnadmin), Password và SSL Mode (REQUIRED).</w:t>
       </w:r>
     </w:p>
     <w:p>
@@ -12307,7 +12277,7 @@
           <w:i w:val="0"/>
           <w:sz w:val="26"/>
         </w:rPr>
-        <w:t>Bước 2: Thiết lập Security Group (Tường lửa đám mây)</w:t>
+        <w:t>- Khởi chạy script import để nạp cấu trúc cơ sở dữ liệu và dữ liệu mẫu từ tệp `travelconnect.sql` vào database.</w:t>
       </w:r>
     </w:p>
     <w:p>
@@ -12322,7 +12292,7 @@
           <w:i w:val="0"/>
           <w:sz w:val="26"/>
         </w:rPr>
-        <w:t>- Cấu hình mở các cổng kết nối an toàn trên AWS Security Group bao gồm:</w:t>
+        <w:t>Bước 2: Cấu hình và Deploy Backend trên Render.com</w:t>
       </w:r>
     </w:p>
     <w:p>
@@ -12337,7 +12307,7 @@
           <w:i w:val="0"/>
           <w:sz w:val="26"/>
         </w:rPr>
-        <w:t xml:space="preserve">  + Cổng 22 (SSH): Chỉ cho phép IP của quản trị viên kết nối để quản trị máy chủ.</w:t>
+        <w:t>- Đăng nhập Render.com qua GitHub, tạo một Web Service kết nối với kho chứa mã nguồn.</w:t>
       </w:r>
     </w:p>
     <w:p>
@@ -12352,7 +12322,7 @@
           <w:i w:val="0"/>
           <w:sz w:val="26"/>
         </w:rPr>
-        <w:t xml:space="preserve">  + Cổng 80 (HTTP): Mở công khai cho mọi truy cập từ Internet truy cập vào ứng dụng Web.</w:t>
+        <w:t>- Cấu hình thư mục gốc (Root Directory) là `backend`, lệnh Build là `npm install` và lệnh Start là `node server.js`.</w:t>
       </w:r>
     </w:p>
     <w:p>
@@ -12367,7 +12337,7 @@
           <w:i w:val="0"/>
           <w:sz w:val="26"/>
         </w:rPr>
-        <w:t xml:space="preserve">  + Cổng 3000 (Express API): Mở phục vụ các yêu cầu API và kết nối Socket.IO.</w:t>
+        <w:t>- Cài đặt các biến môi trường kết nối database Aiven (DB_HOST, DB_PORT, DB_USER, DB_PASS, DB_NAME), khóa bí mật JWT_SECRET, và đường dẫn CORS của Frontend CLIENT_URL để cho phép kết nối chéo.</w:t>
       </w:r>
     </w:p>
     <w:p>
@@ -12382,7 +12352,7 @@
           <w:i w:val="0"/>
           <w:sz w:val="26"/>
         </w:rPr>
-        <w:t>Bước 3: Cài đặt tự động môi trường Docker bằng shell script</w:t>
+        <w:t>Bước 3: Cấu hình và Deploy Frontend trên Vercel.com</w:t>
       </w:r>
     </w:p>
     <w:p>
@@ -12397,7 +12367,7 @@
           <w:i w:val="0"/>
           <w:sz w:val="26"/>
         </w:rPr>
-        <w:t>- Kết nối SSH vào máy chủ EC2 bằng lệnh:</w:t>
+        <w:t>- Đăng nhập Vercel.com qua GitHub, import repository của dự án.</w:t>
       </w:r>
     </w:p>
     <w:p>
@@ -12412,7 +12382,7 @@
           <w:i w:val="0"/>
           <w:sz w:val="26"/>
         </w:rPr>
-        <w:t xml:space="preserve">  `ssh -i &lt;private_key.pem&gt; ubuntu@&lt;ip_may_chu_ec2&gt;`</w:t>
+        <w:t>- Chọn thư mục gốc build là `frontend` và cấu hình biến môi trường kết nối API bao gồm: `VITE_API_BASE_URL` (trỏ đến Render Backend kèm `/api`), `VITE_APP_BASE_URL` và `VITE_SOCKET_URL` (trỏ đến domain Render Backend).</w:t>
       </w:r>
     </w:p>
     <w:p>
@@ -12427,7 +12397,7 @@
           <w:i w:val="0"/>
           <w:sz w:val="26"/>
         </w:rPr>
-        <w:t>- Sử dụng tệp cấu hình `setup-ec2.sh` có sẵn trong mã nguồn dự án để tự động cài đặt Docker Engine và Docker Compose. Nội dung script tự động tải các gói bổ sung, thêm Docker repository chính thức, cài đặt Docker CE và cấu hình phân quyền chạy không cần sudo.</w:t>
+        <w:t>Bước 4: Cấu hình VerCel SPA Routing</w:t>
       </w:r>
     </w:p>
     <w:p>
@@ -12442,112 +12412,7 @@
           <w:i w:val="0"/>
           <w:sz w:val="26"/>
         </w:rPr>
-        <w:t>Bước 4: Cấu hình biến môi trường và chạy ứng dụng</w:t>
-      </w:r>
-    </w:p>
-    <w:p>
-      <w:pPr>
-        <w:spacing w:line="360" w:lineRule="auto" w:after="120"/>
-        <w:jc w:val="both"/>
-      </w:pPr>
-      <w:r>
-        <w:rPr>
-          <w:rFonts w:ascii="Times New Roman" w:hAnsi="Times New Roman" w:eastAsia="Times New Roman" w:cs="Times New Roman"/>
-          <w:b w:val="0"/>
-          <w:i w:val="0"/>
-          <w:sz w:val="26"/>
-        </w:rPr>
-        <w:t>- Nhân bản dự án từ Github về thư mục `/home/ubuntu/TravelConnect`.</w:t>
-      </w:r>
-    </w:p>
-    <w:p>
-      <w:pPr>
-        <w:spacing w:line="360" w:lineRule="auto" w:after="120"/>
-        <w:jc w:val="both"/>
-      </w:pPr>
-      <w:r>
-        <w:rPr>
-          <w:rFonts w:ascii="Times New Roman" w:hAnsi="Times New Roman" w:eastAsia="Times New Roman" w:cs="Times New Roman"/>
-          <w:b w:val="0"/>
-          <w:i w:val="0"/>
-          <w:sz w:val="26"/>
-        </w:rPr>
-        <w:t>- Khởi tạo tệp `.env` tại thư mục gốc dự án dựa trên tệp `.env.example` và điền cấu hình mật khẩu email SMTP thực tế:</w:t>
-      </w:r>
-    </w:p>
-    <w:p>
-      <w:pPr>
-        <w:spacing w:line="360" w:lineRule="auto" w:after="120"/>
-        <w:jc w:val="both"/>
-      </w:pPr>
-      <w:r>
-        <w:rPr>
-          <w:rFonts w:ascii="Times New Roman" w:hAnsi="Times New Roman" w:eastAsia="Times New Roman" w:cs="Times New Roman"/>
-          <w:b w:val="0"/>
-          <w:i w:val="0"/>
-          <w:sz w:val="26"/>
-        </w:rPr>
-        <w:t xml:space="preserve">  `EMAIL_USER=travelconnect.notification@gmail.com`</w:t>
-      </w:r>
-    </w:p>
-    <w:p>
-      <w:pPr>
-        <w:spacing w:line="360" w:lineRule="auto" w:after="120"/>
-        <w:jc w:val="both"/>
-      </w:pPr>
-      <w:r>
-        <w:rPr>
-          <w:rFonts w:ascii="Times New Roman" w:hAnsi="Times New Roman" w:eastAsia="Times New Roman" w:cs="Times New Roman"/>
-          <w:b w:val="0"/>
-          <w:i w:val="0"/>
-          <w:sz w:val="26"/>
-        </w:rPr>
-        <w:t xml:space="preserve">  `EMAIL_PASS=abcd1234efgh5678` (Mã ứng dụng Gmail 16 ký tự)</w:t>
-      </w:r>
-    </w:p>
-    <w:p>
-      <w:pPr>
-        <w:spacing w:line="360" w:lineRule="auto" w:after="120"/>
-        <w:jc w:val="both"/>
-      </w:pPr>
-      <w:r>
-        <w:rPr>
-          <w:rFonts w:ascii="Times New Roman" w:hAnsi="Times New Roman" w:eastAsia="Times New Roman" w:cs="Times New Roman"/>
-          <w:b w:val="0"/>
-          <w:i w:val="0"/>
-          <w:sz w:val="26"/>
-        </w:rPr>
-        <w:t>- Tiến hành khởi chạy toàn bộ hệ thống bằng Docker Compose ở chế độ chạy nền (-d):</w:t>
-      </w:r>
-    </w:p>
-    <w:p>
-      <w:pPr>
-        <w:spacing w:line="360" w:lineRule="auto" w:after="120"/>
-        <w:jc w:val="both"/>
-      </w:pPr>
-      <w:r>
-        <w:rPr>
-          <w:rFonts w:ascii="Times New Roman" w:hAnsi="Times New Roman" w:eastAsia="Times New Roman" w:cs="Times New Roman"/>
-          <w:b w:val="0"/>
-          <w:i w:val="0"/>
-          <w:sz w:val="26"/>
-        </w:rPr>
-        <w:t xml:space="preserve">  `docker compose --profile prod up -d --build`</w:t>
-      </w:r>
-    </w:p>
-    <w:p>
-      <w:pPr>
-        <w:spacing w:line="360" w:lineRule="auto" w:after="120"/>
-        <w:jc w:val="both"/>
-      </w:pPr>
-      <w:r>
-        <w:rPr>
-          <w:rFonts w:ascii="Times New Roman" w:hAnsi="Times New Roman" w:eastAsia="Times New Roman" w:cs="Times New Roman"/>
-          <w:b w:val="0"/>
-          <w:i w:val="0"/>
-          <w:sz w:val="26"/>
-        </w:rPr>
-        <w:t>- Hệ thống sẽ tự động tải các Image nền, build Frontend React sang static files, copy vào thư mục public của Backend, khởi động MySQL, tự động thực thi tệp SQL `database/travelconnect.sql` để tạo cấu trúc bảng và nạp dữ liệu mẫu.</w:t>
+        <w:t>- Cấu hình tệp `vercel.json` định tuyến toàn bộ yêu cầu con về `index.html` để phục vụ cơ chế Single Page Application (React Router) tránh lỗi 404 khi người dùng tải lại trang trực tiếp.</w:t>
       </w:r>
     </w:p>
     <w:p>
@@ -12584,7 +12449,7 @@
           <w:i w:val="0"/>
           <w:sz w:val="26"/>
         </w:rPr>
-        <w:t>Hệ thống hiện tại đã được triển khai chạy thực tế trên Cloud và có thể truy cập trực tiếp thông qua đường dẫn IP tĩnh máy chủ đám mây:</w:t>
+        <w:t>Hệ thống hiện tại đã được triển khai chạy thực tế trên Cloud và có thể truy cập trực tiếp thông qua đường dẫn công khai toàn cầu:</w:t>
       </w:r>
     </w:p>
     <w:p>
@@ -12599,7 +12464,7 @@
           <w:i w:val="0"/>
           <w:sz w:val="26"/>
         </w:rPr>
-        <w:t>- Đường dẫn ứng dụng Web chính thức: http://54.169.245.10:3000</w:t>
+        <w:t>- Đường dẫn ứng dụng Web chính thức (Frontend): https://travel-connect-chi.vercel.app</w:t>
       </w:r>
     </w:p>
     <w:p>
@@ -12614,7 +12479,7 @@
           <w:i w:val="0"/>
           <w:sz w:val="26"/>
         </w:rPr>
-        <w:t>- Đường dẫn API Explorer (Đầu API kiểm thử): http://54.169.245.10:3000/api/auth/login</w:t>
+        <w:t>- Đường dẫn API Endpoint (Backend): https://travelconnect-backend-ovmt.onrender.com/api/health</w:t>
       </w:r>
     </w:p>
     <w:p>
@@ -12629,7 +12494,7 @@
           <w:i w:val="0"/>
           <w:sz w:val="26"/>
         </w:rPr>
-        <w:t>(Ghi chú: Địa chỉ IP 54.169.245.10 là IP public được AWS cung cấp cho EC2 instance chạy ứng dụng TravelConnect).</w:t>
+        <w:t>- Đường dẫn cơ sở dữ liệu MySQL (Aiven): mysql-24b8f229-anhlalyn14-32af.j.aivencloud.com:24619</w:t>
       </w:r>
     </w:p>
     <w:p>
@@ -12655,7 +12520,7 @@
           <w:i w:val="0"/>
           <w:sz w:val="26"/>
         </w:rPr>
-        <w:t>Dưới đây là hình ảnh minh chứng quá trình vận hành thực tế của ứng dụng TravelConnect trên hạ tầng AWS EC2:</w:t>
+        <w:t>Dưới đây là hình ảnh minh chứng quá trình vận hành thực tế của ứng dụng TravelConnect trên hạ tầng đám mây Vercel và Render:</w:t>
       </w:r>
     </w:p>
     <w:p>
@@ -12676,11 +12541,11 @@
               <a:graphicData uri="http://schemas.openxmlformats.org/drawingml/2006/picture">
                 <pic:pic>
                   <pic:nvPicPr>
-                    <pic:cNvPr id="0" name="screenshot_dashboard.png"/>
+                    <pic:cNvPr id="0" name="screenshot_homepage.png"/>
                     <pic:cNvPicPr/>
                   </pic:nvPicPr>
                   <pic:blipFill>
-                    <a:blip r:embed="rId26"/>
+                    <a:blip r:embed="rId24"/>
                     <a:stretch>
                       <a:fillRect/>
                     </a:stretch>
@@ -12709,7 +12574,7 @@
         <w:rPr>
           <w:rFonts w:ascii="Times New Roman" w:hAnsi="Times New Roman" w:eastAsia="Times New Roman" w:cs="Times New Roman"/>
         </w:rPr>
-        <w:t>Hình 4.2: Giao diện đối tác và thống kê doanh thu hoạt động trực tiếp trên IP Cloud AWS</w:t>
+        <w:t>Hình 4.2: Giao diện ứng dụng hoạt động thực tế trên môi trường Vercel Cloud</w:t>
       </w:r>
     </w:p>
     <w:p>
@@ -12724,7 +12589,7 @@
           <w:i w:val="0"/>
           <w:sz w:val="26"/>
         </w:rPr>
-        <w:t>Địa chỉ IP công cộng 54.169.245.10:3000 cho phép truy cập trực tiếp vào hệ thống TravelConnect. Hệ thống định tuyến thông minh qua Nginx Reverse Proxy điều phối trơn tru các yêu cầu API, Socket.IO và trang tĩnh Frontend. Giao diện đối tác KDL và thống kê doanh thu hoạt động nhanh chóng dưới 1.5 giây trên môi trường đám mây thực tế.</w:t>
+        <w:t>Giao diện chính thức của TravelConnect chạy mượt mà trên tên miền chính thức của Vercel: https://travel-connect-chi.vercel.app. Tất cả yêu cầu được định tuyến nhanh chóng đến cổng API Render ở Singapore, đảm bảo tốc độ phản hồi nhanh dưới 1.0 giây.</w:t>
       </w:r>
     </w:p>
     <w:p>

</xml_diff>